<commit_message>
Guide: Leeann is both rights-of-nature reviewer and a submitter
</commit_message>
<xml_diff>
--- a/files/goodlede-rights-of-nature-editor-guide.docx
+++ b/files/goodlede-rights-of-nature-editor-guide.docx
@@ -2,7 +2,7 @@
 <file path=word/document.xml><?xml version="1.0" encoding="utf-8"?>
 <w:document xmlns:w="http://schemas.openxmlformats.org/wordprocessingml/2006/main" xmlns:m="http://schemas.openxmlformats.org/officeDocument/2006/math" xmlns:r="http://schemas.openxmlformats.org/officeDocument/2006/relationships" xmlns:o="urn:schemas-microsoft-com:office:office" xmlns:v="urn:schemas-microsoft-com:vml" xmlns:w10="urn:schemas-microsoft-com:office:word" xmlns:a="http://schemas.openxmlformats.org/drawingml/2006/main" xmlns:pic="http://schemas.openxmlformats.org/drawingml/2006/picture" xmlns:wp="http://schemas.openxmlformats.org/drawingml/2006/wordprocessingDrawing">
   <w:body>
-    <w:bookmarkStart w:id="24" w:name="goodlede-editor-guide-rights-of-nature"/>
+    <w:bookmarkStart w:id="25" w:name="goodlede-editor-guide-rights-of-nature"/>
     <w:p>
       <w:pPr>
         <w:pStyle w:val="Heading1"/>
@@ -44,16 +44,163 @@
         <w:t xml:space="preserve"> </w:t>
       </w:r>
       <w:r>
-        <w:t xml:space="preserve">— the environmental stories about legal personhood and rights for rivers, ecosystems, and the natural world. Your job is to review those stories, shape the honest caveat on each, and pass them to Michael for the final sign-off.</w:t>
-      </w:r>
-    </w:p>
-    <w:bookmarkStart w:id="20" w:name="how-it-works"/>
+        <w:t xml:space="preserve">— the environmental stories about legal standing for the natural world: legal personhood for a river, lake, forest, or ecosystem; court rulings that recognize nature’s rights; new laws in that vein. You shape the honest caveat on each story and pass it to Michael for the final sign-off.</w:t>
+      </w:r>
+    </w:p>
+    <w:p>
+      <w:pPr>
+        <w:pStyle w:val="BodyText"/>
+      </w:pPr>
+      <w:r>
+        <w:t xml:space="preserve">Your role has two parts.</w:t>
+      </w:r>
+    </w:p>
+    <w:bookmarkStart w:id="20" w:name="the-right-stories-come-to-you"/>
     <w:p>
       <w:pPr>
         <w:pStyle w:val="Heading2"/>
       </w:pPr>
       <w:r>
-        <w:t xml:space="preserve">How it works</w:t>
+        <w:t xml:space="preserve">1. The right stories come to you</w:t>
+      </w:r>
+    </w:p>
+    <w:p>
+      <w:pPr>
+        <w:pStyle w:val="FirstParagraph"/>
+      </w:pPr>
+      <w:r>
+        <w:t xml:space="preserve">When an Environment story about rights of nature arrives at Goodlede, it’s routed</w:t>
+      </w:r>
+      <w:r>
+        <w:t xml:space="preserve"> </w:t>
+      </w:r>
+      <w:r>
+        <w:rPr>
+          <w:bCs/>
+          <w:b/>
+        </w:rPr>
+        <w:t xml:space="preserve">automatically to your review desk</w:t>
+      </w:r>
+      <w:r>
+        <w:t xml:space="preserve"> </w:t>
+      </w:r>
+      <w:r>
+        <w:t xml:space="preserve">— a private web page only you can open (we’ll send you the link). You don’t have to go looking for them.</w:t>
+      </w:r>
+    </w:p>
+    <w:p>
+      <w:pPr>
+        <w:pStyle w:val="BodyText"/>
+      </w:pPr>
+      <w:r>
+        <w:t xml:space="preserve">Behind the scenes, we flag stories that mention things like</w:t>
+      </w:r>
+      <w:r>
+        <w:t xml:space="preserve"> </w:t>
+      </w:r>
+      <w:r>
+        <w:rPr>
+          <w:iCs/>
+          <w:i/>
+        </w:rPr>
+        <w:t xml:space="preserve">legal personhood, the rights of a river, nature’s rights,</w:t>
+      </w:r>
+      <w:r>
+        <w:t xml:space="preserve"> </w:t>
+      </w:r>
+      <w:r>
+        <w:t xml:space="preserve">and similar signals. If something lands on your desk that isn’t quite right, just skip it — and if you notice a kind of story we’re missing, tell Michael and we’ll widen the net.</w:t>
+      </w:r>
+    </w:p>
+    <w:bookmarkEnd w:id="20"/>
+    <w:bookmarkStart w:id="21" w:name="you-can-also-submit-stories"/>
+    <w:p>
+      <w:pPr>
+        <w:pStyle w:val="Heading2"/>
+      </w:pPr>
+      <w:r>
+        <w:t xml:space="preserve">2. You can also submit stories</w:t>
+      </w:r>
+    </w:p>
+    <w:p>
+      <w:pPr>
+        <w:pStyle w:val="FirstParagraph"/>
+      </w:pPr>
+      <w:r>
+        <w:t xml:space="preserve">If you come across a good-news story you’d like to run, email the</w:t>
+      </w:r>
+      <w:r>
+        <w:t xml:space="preserve"> </w:t>
+      </w:r>
+      <w:r>
+        <w:rPr>
+          <w:bCs/>
+          <w:b/>
+        </w:rPr>
+        <w:t xml:space="preserve">link</w:t>
+      </w:r>
+      <w:r>
+        <w:t xml:space="preserve"> </w:t>
+      </w:r>
+      <w:r>
+        <w:t xml:space="preserve">to</w:t>
+      </w:r>
+      <w:r>
+        <w:t xml:space="preserve"> </w:t>
+      </w:r>
+      <w:r>
+        <w:rPr>
+          <w:bCs/>
+          <w:b/>
+        </w:rPr>
+        <w:t xml:space="preserve">submit@goodlede.com</w:t>
+      </w:r>
+      <w:r>
+        <w:t xml:space="preserve"> </w:t>
+      </w:r>
+      <w:r>
+        <w:t xml:space="preserve">— one story per email. Goodlede reads the article and places it on</w:t>
+      </w:r>
+      <w:r>
+        <w:t xml:space="preserve"> </w:t>
+      </w:r>
+      <w:r>
+        <w:rPr>
+          <w:bCs/>
+          <w:b/>
+        </w:rPr>
+        <w:t xml:space="preserve">your same desk</w:t>
+      </w:r>
+      <w:r>
+        <w:t xml:space="preserve">, ready for you to add the</w:t>
+      </w:r>
+      <w:r>
+        <w:t xml:space="preserve"> </w:t>
+      </w:r>
+      <w:r>
+        <w:t xml:space="preserve">“</w:t>
+      </w:r>
+      <w:r>
+        <w:t xml:space="preserve">Worth noting</w:t>
+      </w:r>
+      <w:r>
+        <w:t xml:space="preserve">”</w:t>
+      </w:r>
+      <w:r>
+        <w:t xml:space="preserve"> </w:t>
+      </w:r>
+      <w:r>
+        <w:t xml:space="preserve">and approve.</w:t>
+      </w:r>
+    </w:p>
+    <w:bookmarkEnd w:id="21"/>
+    <w:bookmarkStart w:id="22" w:name="the-routine-on-your-desk-either-way"/>
+    <w:p>
+      <w:pPr>
+        <w:pStyle w:val="Heading2"/>
+      </w:pPr>
+      <w:r>
+        <w:t xml:space="preserve">The routine on your desk (either way)</w:t>
       </w:r>
     </w:p>
     <w:p>
@@ -65,33 +212,37 @@
         <w:pStyle w:val="Compact"/>
       </w:pPr>
       <w:r>
+        <w:t xml:space="preserve">Read the</w:t>
+      </w:r>
+      <w:r>
+        <w:t xml:space="preserve"> </w:t>
+      </w:r>
+      <w:r>
         <w:rPr>
           <w:bCs/>
           <w:b/>
         </w:rPr>
-        <w:t xml:space="preserve">Stories come to you.</w:t>
-      </w:r>
-      <w:r>
-        <w:t xml:space="preserve"> </w:t>
-      </w:r>
-      <w:r>
-        <w:t xml:space="preserve">When an Environment story about rights of nature arrives at Goodlede, it’s automatically routed to your</w:t>
-      </w:r>
-      <w:r>
-        <w:t xml:space="preserve"> </w:t>
+        <w:t xml:space="preserve">“</w:t>
       </w:r>
       <w:r>
         <w:rPr>
           <w:bCs/>
           <w:b/>
         </w:rPr>
-        <w:t xml:space="preserve">review desk</w:t>
-      </w:r>
-      <w:r>
-        <w:t xml:space="preserve"> </w:t>
-      </w:r>
-      <w:r>
-        <w:t xml:space="preserve">— a private web page only you can open (we’ll send you the link). You don’t have to go looking for them.</w:t>
+        <w:t xml:space="preserve">What backs it</w:t>
+      </w:r>
+      <w:r>
+        <w:rPr>
+          <w:bCs/>
+          <w:b/>
+        </w:rPr>
+        <w:t xml:space="preserve">”</w:t>
+      </w:r>
+      <w:r>
+        <w:t xml:space="preserve"> </w:t>
+      </w:r>
+      <w:r>
+        <w:t xml:space="preserve">(the evidence).</w:t>
       </w:r>
     </w:p>
     <w:p>
@@ -107,13 +258,41 @@
           <w:bCs/>
           <w:b/>
         </w:rPr>
-        <w:t xml:space="preserve">You’ll get a short nudge twice a day</w:t>
-      </w:r>
-      <w:r>
-        <w:t xml:space="preserve"> </w:t>
-      </w:r>
-      <w:r>
-        <w:t xml:space="preserve">when stories are waiting on your desk.</w:t>
+        <w:t xml:space="preserve">Write or refine the</w:t>
+      </w:r>
+      <w:r>
+        <w:rPr>
+          <w:bCs/>
+          <w:b/>
+        </w:rPr>
+        <w:t xml:space="preserve"> </w:t>
+      </w:r>
+      <w:r>
+        <w:rPr>
+          <w:bCs/>
+          <w:b/>
+        </w:rPr>
+        <w:t xml:space="preserve">“</w:t>
+      </w:r>
+      <w:r>
+        <w:rPr>
+          <w:bCs/>
+          <w:b/>
+        </w:rPr>
+        <w:t xml:space="preserve">Worth noting</w:t>
+      </w:r>
+      <w:r>
+        <w:rPr>
+          <w:bCs/>
+          <w:b/>
+        </w:rPr>
+        <w:t xml:space="preserve">”</w:t>
+      </w:r>
+      <w:r>
+        <w:t xml:space="preserve"> </w:t>
+      </w:r>
+      <w:r>
+        <w:t xml:space="preserve">— the honest line on what the story does and doesn’t mean — in your own words.</w:t>
       </w:r>
     </w:p>
     <w:p>
@@ -125,107 +304,23 @@
         <w:pStyle w:val="Compact"/>
       </w:pPr>
       <w:r>
+        <w:t xml:space="preserve">Recategorize if needed, and</w:t>
+      </w:r>
+      <w:r>
+        <w:t xml:space="preserve"> </w:t>
+      </w:r>
+      <w:r>
         <w:rPr>
           <w:bCs/>
           <w:b/>
         </w:rPr>
-        <w:t xml:space="preserve">You review each one</w:t>
-      </w:r>
-      <w:r>
-        <w:t xml:space="preserve"> </w:t>
-      </w:r>
-      <w:r>
-        <w:t xml:space="preserve">on your desk: read the</w:t>
-      </w:r>
-      <w:r>
-        <w:t xml:space="preserve"> </w:t>
-      </w:r>
-      <w:r>
-        <w:rPr>
-          <w:bCs/>
-          <w:b/>
-        </w:rPr>
-        <w:t xml:space="preserve">“</w:t>
-      </w:r>
-      <w:r>
-        <w:rPr>
-          <w:bCs/>
-          <w:b/>
-        </w:rPr>
-        <w:t xml:space="preserve">What backs it</w:t>
-      </w:r>
-      <w:r>
-        <w:rPr>
-          <w:bCs/>
-          <w:b/>
-        </w:rPr>
-        <w:t xml:space="preserve">”</w:t>
-      </w:r>
-      <w:r>
-        <w:t xml:space="preserve"> </w:t>
-      </w:r>
-      <w:r>
-        <w:t xml:space="preserve">(the evidence),</w:t>
-      </w:r>
-      <w:r>
-        <w:t xml:space="preserve"> </w:t>
-      </w:r>
-      <w:r>
-        <w:rPr>
-          <w:bCs/>
-          <w:b/>
-        </w:rPr>
-        <w:t xml:space="preserve">write or refine the</w:t>
-      </w:r>
-      <w:r>
-        <w:rPr>
-          <w:bCs/>
-          <w:b/>
-        </w:rPr>
-        <w:t xml:space="preserve"> </w:t>
-      </w:r>
-      <w:r>
-        <w:rPr>
-          <w:bCs/>
-          <w:b/>
-        </w:rPr>
-        <w:t xml:space="preserve">“</w:t>
-      </w:r>
-      <w:r>
-        <w:rPr>
-          <w:bCs/>
-          <w:b/>
-        </w:rPr>
-        <w:t xml:space="preserve">Worth noting</w:t>
-      </w:r>
-      <w:r>
-        <w:rPr>
-          <w:bCs/>
-          <w:b/>
-        </w:rPr>
-        <w:t xml:space="preserve">”</w:t>
-      </w:r>
-      <w:r>
-        <w:t xml:space="preserve"> </w:t>
-      </w:r>
-      <w:r>
-        <w:t xml:space="preserve">— the honest line on what the story does and doesn’t mean — in your own words, recategorize if needed, and</w:t>
-      </w:r>
-      <w:r>
-        <w:t xml:space="preserve"> </w:t>
-      </w:r>
-      <w:r>
-        <w:rPr>
-          <w:bCs/>
-          <w:b/>
-        </w:rPr>
         <w:t xml:space="preserve">approve</w:t>
       </w:r>
       <w:r>
         <w:t xml:space="preserve"> </w:t>
       </w:r>
       <w:r>
-        <w:t xml:space="preserve">it (or skip it).</w:t>
+        <w:t xml:space="preserve">(or skip).</w:t>
       </w:r>
     </w:p>
     <w:p>
@@ -237,17 +332,17 @@
         <w:pStyle w:val="Compact"/>
       </w:pPr>
       <w:r>
+        <w:t xml:space="preserve">Your approval goes to</w:t>
+      </w:r>
+      <w:r>
+        <w:t xml:space="preserve"> </w:t>
+      </w:r>
+      <w:r>
         <w:rPr>
           <w:bCs/>
           <w:b/>
         </w:rPr>
-        <w:t xml:space="preserve">Michael gives the final sign-off.</w:t>
-      </w:r>
-      <w:r>
-        <w:t xml:space="preserve"> </w:t>
-      </w:r>
-      <w:r>
-        <w:t xml:space="preserve">Your approvals go to him, and</w:t>
+        <w:t xml:space="preserve">Michael for the final sign-off.</w:t>
       </w:r>
       <w:r>
         <w:t xml:space="preserve"> </w:t>
@@ -257,7 +352,7 @@
           <w:bCs/>
           <w:b/>
         </w:rPr>
-        <w:t xml:space="preserve">nothing publishes until he approves.</w:t>
+        <w:t xml:space="preserve">Nothing publishes until he approves.</w:t>
       </w:r>
       <w:r>
         <w:t xml:space="preserve"> </w:t>
@@ -266,26 +361,8 @@
         <w:t xml:space="preserve">If he adjusts anything, you’ll get a quick note showing what changed.</w:t>
       </w:r>
     </w:p>
-    <w:bookmarkEnd w:id="20"/>
-    <w:bookmarkStart w:id="21" w:name="your-review-desk"/>
-    <w:p>
-      <w:pPr>
-        <w:pStyle w:val="Heading2"/>
-      </w:pPr>
-      <w:r>
-        <w:t xml:space="preserve">Your review desk</w:t>
-      </w:r>
-    </w:p>
-    <w:p>
-      <w:pPr>
-        <w:pStyle w:val="FirstParagraph"/>
-      </w:pPr>
-      <w:r>
-        <w:t xml:space="preserve">It’s a private link — no login, just bookmark it. Your assigned stories appear there as cards, each with an approve / edit-the-caveat / skip option. It’s the same review tool Michael uses, scoped to only your stories.</w:t>
-      </w:r>
-    </w:p>
-    <w:bookmarkEnd w:id="21"/>
-    <w:bookmarkStart w:id="22" w:name="the-worth-noting-line"/>
+    <w:bookmarkEnd w:id="22"/>
+    <w:bookmarkStart w:id="23" w:name="the-worth-noting-line"/>
     <w:p>
       <w:pPr>
         <w:pStyle w:val="Heading2"/>
@@ -365,14 +442,14 @@
         <w:t xml:space="preserve">; Michael sees your version at sign-off.</w:t>
       </w:r>
     </w:p>
-    <w:bookmarkEnd w:id="22"/>
-    <w:bookmarkStart w:id="23" w:name="whats-a-good-fit-for-you"/>
+    <w:bookmarkEnd w:id="23"/>
+    <w:bookmarkStart w:id="24" w:name="whats-a-good-fit"/>
     <w:p>
       <w:pPr>
         <w:pStyle w:val="Heading2"/>
       </w:pPr>
       <w:r>
-        <w:t xml:space="preserve">What’s a good fit for you</w:t>
+        <w:t xml:space="preserve">What’s a good fit</w:t>
       </w:r>
     </w:p>
     <w:p>
@@ -380,7 +457,7 @@
         <w:pStyle w:val="FirstParagraph"/>
       </w:pPr>
       <w:r>
-        <w:t xml:space="preserve">Environment stories where nature is granted legal standing or rights — legal personhood for a river, lake, forest, or ecosystem; court rulings recognizing nature’s rights; new laws in that vein. If something gets routed to you that isn’t quite right, just skip it.</w:t>
+        <w:t xml:space="preserve">Environment stories where nature is granted legal standing or rights — legal personhood for a river, lake, forest, or ecosystem; rulings recognizing nature’s rights; new laws in that vein. For your own submissions, the usual Goodlede bar applies: genuinely good news, a reputable/original source, a single specific article (not a roundup), nothing political.</w:t>
       </w:r>
     </w:p>
     <w:p>
@@ -402,8 +479,8 @@
         <w:t xml:space="preserve">Goodlede · Wag Media, LLC</w:t>
       </w:r>
     </w:p>
-    <w:bookmarkEnd w:id="23"/>
     <w:bookmarkEnd w:id="24"/>
+    <w:bookmarkEnd w:id="25"/>
     <w:sectPr/>
   </w:body>
 </w:document>

</xml_diff>